<commit_message>
cambios antes del 2020-08-27
</commit_message>
<xml_diff>
--- a/Documentation/Guia de Instalacion Desarrollador.docx
+++ b/Documentation/Guia de Instalacion Desarrollador.docx
@@ -1147,17 +1147,116 @@
       </w:pPr>
       <w:r>
         <w:rPr>
+          <w:lang w:val="es-AR"/>
+        </w:rPr>
+        <w:t xml:space="preserve">2) </w:t>
+      </w:r>
+      <w:proofErr w:type="spellStart"/>
+      <w:r>
+        <w:rPr>
+          <w:lang w:val="es-AR"/>
+        </w:rPr>
+        <w:t>PyQtChart</w:t>
+      </w:r>
+      <w:proofErr w:type="spellEnd"/>
+      <w:r>
+        <w:rPr>
+          <w:lang w:val="es-AR"/>
+        </w:rPr>
+        <w:t xml:space="preserve">: Una librería que expande la interfaz de QT usada en Lantz con </w:t>
+      </w:r>
+      <w:r>
+        <w:rPr>
+          <w:lang w:val="es-AR"/>
+        </w:rPr>
+        <w:t>gráficos</w:t>
+      </w:r>
+      <w:r>
+        <w:rPr>
+          <w:lang w:val="es-AR"/>
+        </w:rPr>
+        <w:t xml:space="preserve"> dinámicos.</w:t>
+      </w:r>
+    </w:p>
+    <w:p>
+      <w:pPr>
+        <w:rPr>
+          <w:lang w:val="es-AR"/>
+        </w:rPr>
+      </w:pPr>
+      <w:r>
+        <w:rPr>
+          <w:lang w:val="es-AR"/>
+        </w:rPr>
+        <w:t xml:space="preserve">3) </w:t>
+      </w:r>
+      <w:proofErr w:type="spellStart"/>
+      <w:r>
+        <w:rPr>
+          <w:lang w:val="es-AR"/>
+        </w:rPr>
+        <w:t>O</w:t>
+      </w:r>
+      <w:r>
+        <w:rPr>
+          <w:lang w:val="es-AR"/>
+        </w:rPr>
+        <w:t>pencv</w:t>
+      </w:r>
+      <w:proofErr w:type="spellEnd"/>
+      <w:r>
+        <w:rPr>
+          <w:lang w:val="es-AR"/>
+        </w:rPr>
+        <w:t>: Una librería de código abierto usado para manipular y sacar imágenes de las webcams.</w:t>
+      </w:r>
+    </w:p>
+    <w:p>
+      <w:pPr>
+        <w:rPr>
+          <w:lang w:val="es-AR"/>
+        </w:rPr>
+      </w:pPr>
+      <w:r>
+        <w:rPr>
+          <w:lang w:val="es-AR"/>
+        </w:rPr>
+        <w:t xml:space="preserve">4) </w:t>
+      </w:r>
+      <w:proofErr w:type="spellStart"/>
+      <w:r>
+        <w:rPr>
+          <w:lang w:val="es-AR"/>
+        </w:rPr>
+        <w:t>pyvisa</w:t>
+      </w:r>
+      <w:proofErr w:type="spellEnd"/>
+      <w:r>
+        <w:rPr>
+          <w:lang w:val="es-AR"/>
+        </w:rPr>
+        <w:t>: Una interfaz de Python para instalar drivers que utilizan la base de datos de VISA</w:t>
+      </w:r>
+    </w:p>
+    <w:p>
+      <w:pPr>
+        <w:rPr>
+          <w:lang w:val="es-AR"/>
+        </w:rPr>
+      </w:pPr>
+      <w:r>
+        <w:rPr>
           <w:noProof/>
           <w:lang w:val="es-AR"/>
         </w:rPr>
         <w:drawing>
-          <wp:anchor distT="0" distB="0" distL="114300" distR="114300" simplePos="0" relativeHeight="251666432" behindDoc="1" locked="0" layoutInCell="1" allowOverlap="1" wp14:anchorId="27978111" wp14:editId="079C372A">
+          <wp:anchor distT="0" distB="0" distL="114300" distR="114300" simplePos="0" relativeHeight="251666432" behindDoc="1" locked="0" layoutInCell="1" allowOverlap="1" wp14:anchorId="27978111" wp14:editId="4E21051E">
             <wp:simplePos x="0" y="0"/>
             <wp:positionH relativeFrom="margin">
               <wp:align>right</wp:align>
             </wp:positionH>
             <wp:positionV relativeFrom="paragraph">
-              <wp:posOffset>775335</wp:posOffset>
+              <wp:posOffset>346710</wp:posOffset>
             </wp:positionV>
             <wp:extent cx="6646545" cy="2380615"/>
             <wp:effectExtent l="0" t="0" r="1905" b="635"/>
@@ -1219,66 +1318,49 @@
         <w:rPr>
           <w:lang w:val="es-AR"/>
         </w:rPr>
-        <w:t xml:space="preserve">2) </w:t>
+        <w:t xml:space="preserve">5) </w:t>
       </w:r>
       <w:proofErr w:type="spellStart"/>
       <w:r>
         <w:rPr>
           <w:lang w:val="es-AR"/>
         </w:rPr>
-        <w:t>PyQtChart</w:t>
+        <w:t>gpib-ctypes</w:t>
       </w:r>
       <w:proofErr w:type="spellEnd"/>
       <w:r>
         <w:rPr>
           <w:lang w:val="es-AR"/>
         </w:rPr>
-        <w:t xml:space="preserve">: Una librería que expande la interfaz de QT usada en Lantz con </w:t>
-      </w:r>
-      <w:r>
-        <w:rPr>
-          <w:lang w:val="es-AR"/>
-        </w:rPr>
-        <w:t>gráficos</w:t>
-      </w:r>
-      <w:r>
-        <w:rPr>
-          <w:lang w:val="es-AR"/>
-        </w:rPr>
-        <w:t xml:space="preserve"> dinámicos.</w:t>
-      </w:r>
-    </w:p>
-    <w:p>
-      <w:pPr>
-        <w:rPr>
-          <w:lang w:val="es-AR"/>
-        </w:rPr>
-      </w:pPr>
-      <w:r>
-        <w:rPr>
-          <w:lang w:val="es-AR"/>
-        </w:rPr>
-        <w:t xml:space="preserve">3) </w:t>
+        <w:t xml:space="preserve">: Una interfaz de Python para mandar mensajes a </w:t>
       </w:r>
       <w:proofErr w:type="spellStart"/>
       <w:r>
         <w:rPr>
           <w:lang w:val="es-AR"/>
         </w:rPr>
-        <w:t>O</w:t>
-      </w:r>
-      <w:r>
-        <w:rPr>
-          <w:lang w:val="es-AR"/>
-        </w:rPr>
-        <w:t>pencv</w:t>
+        <w:t>a</w:t>
       </w:r>
       <w:proofErr w:type="spellEnd"/>
       <w:r>
         <w:rPr>
           <w:lang w:val="es-AR"/>
         </w:rPr>
-        <w:t>: Una librería de código abierto usado para manipular y sacar imágenes de las webcams.</w:t>
+        <w:t xml:space="preserve"> </w:t>
+      </w:r>
+      <w:proofErr w:type="spellStart"/>
+      <w:r>
+        <w:rPr>
+          <w:lang w:val="es-AR"/>
+        </w:rPr>
+        <w:t>travez</w:t>
+      </w:r>
+      <w:proofErr w:type="spellEnd"/>
+      <w:r>
+        <w:rPr>
+          <w:lang w:val="es-AR"/>
+        </w:rPr>
+        <w:t xml:space="preserve"> de una interfaz GPIB</w:t>
       </w:r>
     </w:p>
     <w:p>

</xml_diff>